<commit_message>
Fix task editor cleanup on logout and reconcile final documentation
</commit_message>
<xml_diff>
--- a/CS341_Project_I_TaskTracker_Alexander_Goda_Amanda_Cabrera/docs/CS341_Project_I_Testing_Report_Alexander_Goda_Amanda_Cabrera.docx
+++ b/CS341_Project_I_TaskTracker_Alexander_Goda_Amanda_Cabrera/docs/CS341_Project_I_Testing_Report_Alexander_Goda_Amanda_Cabrera.docx
@@ -7,6 +7,9 @@
         <w:pStyle w:val="Title"/>
       </w:pPr>
       <w:r>
+        <w:rPr>
+          <w:color w:val="000000"/>
+        </w:rPr>
         <w:t>CS341 Project I Testing Report</w:t>
       </w:r>
     </w:p>
@@ -15,6 +18,9 @@
         <w:pStyle w:val="Subtitle"/>
       </w:pPr>
       <w:r>
+        <w:rPr>
+          <w:color w:val="000000"/>
+        </w:rPr>
         <w:t>Task Tracker Collaborative To Do List Application</w:t>
       </w:r>
     </w:p>
@@ -34,6 +40,9 @@
         <w:pStyle w:val="Heading1"/>
       </w:pPr>
       <w:r>
+        <w:rPr>
+          <w:color w:val="000000"/>
+        </w:rPr>
         <w:t>1 Testing Objectives and Scope</w:t>
       </w:r>
     </w:p>
@@ -48,16 +57,31 @@
       </w:r>
     </w:p>
     <w:p>
+      <w:pPr/>
+      <w:r>
+        <w:t>The post-fix Eclipse JUnit rerun on October 16, 2026 completed 25/25 tests with 0 errors and 0 failures in 0.413 seconds, as shown in the 11:33 PM screenshot. The existing suite still contains 25 methods; no new automated GUI test was added. Manual regression check M10 passed: the user confirmed that both New Task and Edit Task windows closed automatically when Logout was clicked. The subsequent screenshot shows Amanda's dashboard without the old editors. This is manual GUI evidence, separate from the JUnit rerun.</w:t>
+      </w:r>
+    </w:p>
+    <w:p>
       <w:pPr>
         <w:pStyle w:val="Heading1"/>
       </w:pPr>
       <w:r>
+        <w:rPr>
+          <w:color w:val="000000"/>
+        </w:rPr>
         <w:t>2 Automated Testing Environment</w:t>
       </w:r>
     </w:p>
     <w:p>
       <w:r>
         <w:t>The Java project was tested in Eclipse using JUnit Jupiter (JUnit 5). The application uses a local SQLite database accessed through JDBC. Its startup console identified tasks.db and reported “Task Tracker database initialized successfully.” The desktop application was launched by running Main.java as a Java Application.</w:t>
+      </w:r>
+    </w:p>
+    <w:p>
+      <w:pPr/>
+      <w:r>
+        <w:t>Project configuration: Java 11 compiler source/target and the Eclipse JUnit 5 container. The SQLite JDBC classpath entry is lib/sqlite-jdbc-3.53.4.0.jar. These settings do not establish the exact JDK or JUnit Jupiter patch version used in the recorded run.</w:t>
       </w:r>
     </w:p>
     <w:p>
@@ -70,6 +94,9 @@
         <w:pStyle w:val="Heading1"/>
       </w:pPr>
       <w:r>
+        <w:rPr>
+          <w:color w:val="000000"/>
+        </w:rPr>
         <w:t>3 Verified Execution Results</w:t>
       </w:r>
     </w:p>
@@ -469,6 +496,101 @@
           </w:p>
         </w:tc>
       </w:tr>
+      <w:tr>
+        <w:trPr>
+          <w:cantSplit/>
+        </w:trPr>
+        <w:tc>
+          <w:tcPr>
+            <w:tcW w:type="dxa" w:w="2880"/>
+            <w:vAlign w:val="center"/>
+            <w:tcBorders>
+              <w:top w:val="single" w:sz="4" w:color="D9D9D9"/>
+              <w:left w:val="single" w:sz="4" w:color="D9D9D9"/>
+              <w:bottom w:val="single" w:sz="4" w:color="D9D9D9"/>
+              <w:right w:val="single" w:sz="4" w:color="D9D9D9"/>
+            </w:tcBorders>
+            <w:tcMar>
+              <w:top w:w="85" w:type="dxa"/>
+              <w:left w:w="85" w:type="dxa"/>
+              <w:bottom w:w="85" w:type="dxa"/>
+              <w:right w:w="85" w:type="dxa"/>
+            </w:tcMar>
+          </w:tcPr>
+          <w:p>
+            <w:pPr>
+              <w:spacing w:after="40" w:line="240" w:lineRule="auto"/>
+            </w:pPr>
+            <w:r>
+              <w:rPr>
+                <w:b w:val="0"/>
+                <w:sz w:val="20"/>
+              </w:rPr>
+              <w:t>Post-fix JUnit rerun</w:t>
+            </w:r>
+          </w:p>
+        </w:tc>
+        <w:tc>
+          <w:tcPr>
+            <w:tcW w:type="dxa" w:w="5256"/>
+            <w:vAlign w:val="center"/>
+            <w:tcBorders>
+              <w:top w:val="single" w:sz="4" w:color="D9D9D9"/>
+              <w:left w:val="single" w:sz="4" w:color="D9D9D9"/>
+              <w:bottom w:val="single" w:sz="4" w:color="D9D9D9"/>
+              <w:right w:val="single" w:sz="4" w:color="D9D9D9"/>
+            </w:tcBorders>
+            <w:tcMar>
+              <w:top w:w="85" w:type="dxa"/>
+              <w:left w:w="85" w:type="dxa"/>
+              <w:bottom w:w="85" w:type="dxa"/>
+              <w:right w:w="85" w:type="dxa"/>
+            </w:tcMar>
+          </w:tcPr>
+          <w:p>
+            <w:pPr>
+              <w:spacing w:after="40" w:line="240" w:lineRule="auto"/>
+            </w:pPr>
+            <w:r>
+              <w:rPr>
+                <w:b w:val="0"/>
+                <w:sz w:val="20"/>
+              </w:rPr>
+              <w:t>Runs 25/25; Errors 0; Failures 0; 0.413 seconds</w:t>
+            </w:r>
+          </w:p>
+        </w:tc>
+        <w:tc>
+          <w:tcPr>
+            <w:tcW w:type="dxa" w:w="1800"/>
+            <w:vAlign w:val="center"/>
+            <w:tcBorders>
+              <w:top w:val="single" w:sz="4" w:color="D9D9D9"/>
+              <w:left w:val="single" w:sz="4" w:color="D9D9D9"/>
+              <w:bottom w:val="single" w:sz="4" w:color="D9D9D9"/>
+              <w:right w:val="single" w:sz="4" w:color="D9D9D9"/>
+            </w:tcBorders>
+            <w:tcMar>
+              <w:top w:w="85" w:type="dxa"/>
+              <w:left w:w="85" w:type="dxa"/>
+              <w:bottom w:w="85" w:type="dxa"/>
+              <w:right w:w="85" w:type="dxa"/>
+            </w:tcMar>
+          </w:tcPr>
+          <w:p>
+            <w:pPr>
+              <w:spacing w:after="40" w:line="240" w:lineRule="auto"/>
+            </w:pPr>
+            <w:r>
+              <w:rPr>
+                <w:b w:val="0"/>
+                <w:sz w:val="20"/>
+              </w:rPr>
+              <w:t>PASS</w:t>
+            </w:r>
+          </w:p>
+        </w:tc>
+      </w:tr>
     </w:tbl>
     <w:p>
       <w:r>
@@ -476,15 +598,14 @@
       </w:r>
     </w:p>
     <w:p>
-      <w:r>
-        <w:br w:type="page"/>
-      </w:r>
-    </w:p>
-    <w:p>
       <w:pPr>
         <w:pStyle w:val="Heading1"/>
+        <w:pageBreakBefore/>
       </w:pPr>
       <w:r>
+        <w:rPr>
+          <w:color w:val="000000"/>
+        </w:rPr>
         <w:t>4 Automated Test Summary</w:t>
       </w:r>
     </w:p>
@@ -498,6 +619,9 @@
         <w:pStyle w:val="Heading2"/>
       </w:pPr>
       <w:r>
+        <w:rPr>
+          <w:color w:val="000000"/>
+        </w:rPr>
         <w:t>DatabaseManagerTest   2 tests</w:t>
       </w:r>
     </w:p>
@@ -528,6 +652,9 @@
         <w:pStyle w:val="Heading2"/>
       </w:pPr>
       <w:r>
+        <w:rPr>
+          <w:color w:val="000000"/>
+        </w:rPr>
         <w:t>UserDAOTest   5 tests</w:t>
       </w:r>
     </w:p>
@@ -591,6 +718,9 @@
         <w:pStyle w:val="Heading2"/>
       </w:pPr>
       <w:r>
+        <w:rPr>
+          <w:color w:val="000000"/>
+        </w:rPr>
         <w:t>TaskDAOTest   6 tests</w:t>
       </w:r>
     </w:p>
@@ -665,6 +795,9 @@
         <w:pStyle w:val="Heading2"/>
       </w:pPr>
       <w:r>
+        <w:rPr>
+          <w:color w:val="000000"/>
+        </w:rPr>
         <w:t>AuthControllerTest   6 tests</w:t>
       </w:r>
     </w:p>
@@ -739,6 +872,9 @@
         <w:pStyle w:val="Heading2"/>
       </w:pPr>
       <w:r>
+        <w:rPr>
+          <w:color w:val="000000"/>
+        </w:rPr>
         <w:t>TaskControllerTest   6 tests</w:t>
       </w:r>
     </w:p>
@@ -809,15 +945,14 @@
       </w:r>
     </w:p>
     <w:p>
-      <w:r>
-        <w:br w:type="page"/>
-      </w:r>
-    </w:p>
-    <w:p>
       <w:pPr>
         <w:pStyle w:val="Heading1"/>
+        <w:pageBreakBefore/>
       </w:pPr>
       <w:r>
+        <w:rPr>
+          <w:color w:val="000000"/>
+        </w:rPr>
         <w:t>5 Manual Acceptance Test Results</w:t>
       </w:r>
     </w:p>
@@ -2094,23 +2229,147 @@
           </w:p>
         </w:tc>
       </w:tr>
+      <w:tr>
+        <w:trPr>
+          <w:cantSplit/>
+        </w:trPr>
+        <w:tc>
+          <w:tcPr>
+            <w:tcW w:type="dxa" w:w="1699"/>
+            <w:vAlign w:val="center"/>
+            <w:tcBorders>
+              <w:top w:val="single" w:sz="4" w:color="D9D9D9"/>
+              <w:left w:val="single" w:sz="4" w:color="D9D9D9"/>
+              <w:bottom w:val="single" w:sz="4" w:color="D9D9D9"/>
+              <w:right w:val="single" w:sz="4" w:color="D9D9D9"/>
+            </w:tcBorders>
+            <w:tcMar>
+              <w:top w:w="85" w:type="dxa"/>
+              <w:left w:w="85" w:type="dxa"/>
+              <w:bottom w:w="85" w:type="dxa"/>
+              <w:right w:w="85" w:type="dxa"/>
+            </w:tcMar>
+          </w:tcPr>
+          <w:p>
+            <w:pPr>
+              <w:spacing w:after="40" w:line="240" w:lineRule="auto"/>
+            </w:pPr>
+            <w:r>
+              <w:rPr>
+                <w:b w:val="0"/>
+                <w:sz w:val="20"/>
+              </w:rPr>
+              <w:t>M10 Logout closes task editors</w:t>
+            </w:r>
+          </w:p>
+        </w:tc>
+        <w:tc>
+          <w:tcPr>
+            <w:tcW w:type="dxa" w:w="2232"/>
+            <w:vAlign w:val="center"/>
+            <w:tcBorders>
+              <w:top w:val="single" w:sz="4" w:color="D9D9D9"/>
+              <w:left w:val="single" w:sz="4" w:color="D9D9D9"/>
+              <w:bottom w:val="single" w:sz="4" w:color="D9D9D9"/>
+              <w:right w:val="single" w:sz="4" w:color="D9D9D9"/>
+            </w:tcBorders>
+            <w:tcMar>
+              <w:top w:w="85" w:type="dxa"/>
+              <w:left w:w="85" w:type="dxa"/>
+              <w:bottom w:w="85" w:type="dxa"/>
+              <w:right w:w="85" w:type="dxa"/>
+            </w:tcMar>
+          </w:tcPr>
+          <w:p>
+            <w:pPr>
+              <w:spacing w:after="40" w:line="240" w:lineRule="auto"/>
+            </w:pPr>
+            <w:r>
+              <w:rPr>
+                <w:b w:val="0"/>
+                <w:sz w:val="20"/>
+              </w:rPr>
+              <w:t>Close New Task and Edit Task windows automatically on logout; no old editors remain in the next session.</w:t>
+            </w:r>
+          </w:p>
+        </w:tc>
+        <w:tc>
+          <w:tcPr>
+            <w:tcW w:type="dxa" w:w="5069"/>
+            <w:vAlign w:val="center"/>
+            <w:tcBorders>
+              <w:top w:val="single" w:sz="4" w:color="D9D9D9"/>
+              <w:left w:val="single" w:sz="4" w:color="D9D9D9"/>
+              <w:bottom w:val="single" w:sz="4" w:color="D9D9D9"/>
+              <w:right w:val="single" w:sz="4" w:color="D9D9D9"/>
+            </w:tcBorders>
+            <w:tcMar>
+              <w:top w:w="85" w:type="dxa"/>
+              <w:left w:w="85" w:type="dxa"/>
+              <w:bottom w:w="85" w:type="dxa"/>
+              <w:right w:w="85" w:type="dxa"/>
+            </w:tcMar>
+          </w:tcPr>
+          <w:p>
+            <w:pPr>
+              <w:spacing w:after="40" w:line="240" w:lineRule="auto"/>
+            </w:pPr>
+            <w:r>
+              <w:rPr>
+                <w:b w:val="0"/>
+                <w:sz w:val="20"/>
+              </w:rPr>
+              <w:t>Both editors closed automatically on Logout, as confirmed by the user. The subsequent Amanda dashboard screenshot shows no old editors.</w:t>
+            </w:r>
+          </w:p>
+        </w:tc>
+        <w:tc>
+          <w:tcPr>
+            <w:tcW w:type="dxa" w:w="936"/>
+            <w:vAlign w:val="center"/>
+            <w:tcBorders>
+              <w:top w:val="single" w:sz="4" w:color="D9D9D9"/>
+              <w:left w:val="single" w:sz="4" w:color="D9D9D9"/>
+              <w:bottom w:val="single" w:sz="4" w:color="D9D9D9"/>
+              <w:right w:val="single" w:sz="4" w:color="D9D9D9"/>
+            </w:tcBorders>
+            <w:tcMar>
+              <w:top w:w="85" w:type="dxa"/>
+              <w:left w:w="85" w:type="dxa"/>
+              <w:bottom w:w="85" w:type="dxa"/>
+              <w:right w:w="85" w:type="dxa"/>
+            </w:tcMar>
+          </w:tcPr>
+          <w:p>
+            <w:pPr>
+              <w:spacing w:after="40" w:line="240" w:lineRule="auto"/>
+            </w:pPr>
+            <w:r>
+              <w:rPr>
+                <w:b w:val="0"/>
+                <w:sz w:val="20"/>
+              </w:rPr>
+              <w:t>PASS</w:t>
+            </w:r>
+          </w:p>
+        </w:tc>
+      </w:tr>
     </w:tbl>
-    <w:p>
-      <w:r>
-        <w:br w:type="page"/>
-      </w:r>
-    </w:p>
     <w:p>
       <w:pPr>
         <w:pStyle w:val="Heading1"/>
+        <w:pageBreakBefore/>
       </w:pPr>
       <w:r>
+        <w:rPr>
+          <w:color w:val="000000"/>
+        </w:rPr>
         <w:t>6 Overall Conclusion</w:t>
       </w:r>
     </w:p>
     <w:p>
       <w:r>
-        <w:t>The Task Tracker project passed the recorded automated suite of 25 tests, with 0 errors and 0 failures. Eclipse reported 0 errors and 0 warnings. All nine manual acceptance checks listed in this report passed, including duplicate registration rejection, shared task creation and visibility, creator-only edit and delete restrictions, assignee completion, input validation, and persistence after a full restart.</w:t>
+        <w:t>The original automated run passed 25 tests with 0 errors and 0 failures; its Eclipse Problems view reported 0 errors and 0 warnings. The post-fix rerun also passed 25/25 with 0 errors and 0 failures in 0.413 seconds. All ten manual checks now listed passed: the original M01-M09 and the user-confirmed logout regression check M10. The rerun screenshot does not independently establish a new Problems-view warning count.</w:t>
       </w:r>
     </w:p>
     <w:p>
@@ -2120,7 +2379,13 @@
     </w:p>
     <w:p>
       <w:r>
-        <w:t>These results establish that the documented checks passed. They do not establish exhaustive coverage of every possible input or execution condition. Successful creator editing and deletion, logout, assignment removal and unrelated-user completion denial are covered by automated tests; this report does not present them as separately executed manual acceptance checks.</w:t>
+        <w:t>These results establish that the documented checks passed. They do not establish exhaustive coverage of every possible input or execution condition. Successful creator editing and deletion, assignment removal and unrelated-user completion denial are covered by automated tests; this report does not present them as separately executed manual acceptance checks.</w:t>
+      </w:r>
+    </w:p>
+    <w:p>
+      <w:pPr/>
+      <w:r>
+        <w:t>Remaining coverage limits: the automated suite has no dedicated assertions for default MEDIUM priority, blank task titles, completion reopening, or editor/logout behavior. Blank-title rejection has manual evidence in M07. The earlier editor/logout limitation was corrected: the dashboard now closes its editors before ending the session. M10 records the user-confirmed manual pass; the JUnit rerun is a separate regression result. No claim of exhaustive session/error-condition coverage is made.</w:t>
       </w:r>
     </w:p>
     <w:p>
@@ -2128,6 +2393,9 @@
         <w:pStyle w:val="Heading1"/>
       </w:pPr>
       <w:r>
+        <w:rPr>
+          <w:color w:val="000000"/>
+        </w:rPr>
         <w:t>7 Evidence and Project References</w:t>
       </w:r>
     </w:p>
@@ -2149,6 +2417,11 @@
     <w:p>
       <w:r>
         <w:t>4. Manual acceptance evidence recorded during the October 16, 2026 project testing session, including the validation dialogs, Amanda’s task dashboard and the post-restart dashboard. The final persistence confirmation identifies task ID 4; the full task title was confirmed in the earlier task view.</w:t>
+      </w:r>
+    </w:p>
+    <w:p>
+      <w:r>
+        <w:t>5. Post-fix evidence supplied by the user on October 16, 2026: screenshots at 11:31 PM and 11:32 PM showing the open editors and subsequent Amanda dashboard; user confirmation that Logout closed both editors automatically; and the 11:33 PM Eclipse JUnit screenshot showing Runs 25/25, Errors 0, Failures 0, and 0.413 seconds.</w:t>
       </w:r>
     </w:p>
     <w:sectPr>
@@ -2668,7 +2941,7 @@
       <w:rFonts w:cstheme="majorBidi" w:ascii="Times New Roman" w:hAnsi="Times New Roman"/>
       <w:b/>
       <w:bCs/>
-      <w:color w:val="4F81BD" w:themeColor="accent1"/>
+      <w:color w:val="000000"/>
     </w:rPr>
   </w:style>
   <w:style w:type="paragraph" w:styleId="Heading4">

</xml_diff>

<commit_message>
Cover session and task edge cases and record 28 passing tests
</commit_message>
<xml_diff>
--- a/CS341_Project_I_TaskTracker_Alexander_Goda_Amanda_Cabrera/docs/CS341_Project_I_Testing_Report_Alexander_Goda_Amanda_Cabrera.docx
+++ b/CS341_Project_I_TaskTracker_Alexander_Goda_Amanda_Cabrera/docs/CS341_Project_I_Testing_Report_Alexander_Goda_Amanda_Cabrera.docx
@@ -2424,6 +2424,24 @@
         <w:t>5. Post-fix evidence supplied by the user on October 16, 2026: screenshots at 11:31 PM and 11:32 PM showing the open editors and subsequent Amanda dashboard; user confirmation that Logout closed both editors automatically; and the 11:33 PM Eclipse JUnit screenshot showing Runs 25/25, Errors 0, Failures 0, and 0.413 seconds.</w:t>
       </w:r>
     </w:p>
+    <w:p>
+      <w:r>
+        <w:br w:type="page"/>
+      </w:r>
+    </w:p>
+    <w:p>
+      <w:pPr>
+        <w:pStyle w:val="Heading1"/>
+      </w:pPr>
+      <w:r>
+        <w:t>Final audit addendum</w:t>
+      </w:r>
+    </w:p>
+    <w:p>
+      <w:r>
+        <w:t>Final audit addendum dated October 16, 2026. This addendum supersedes current-suite counts and coverage-limit statements above while preserving historical results and Week 1/Week 2 plans. The expanded Eclipse JUnit 5 suite passed 28/28 tests with 0 errors and 0 failures in 0.444 seconds. Class counts are DatabaseManagerTest 2, UserDAOTest 5, TaskDAOTest 6, AuthControllerTest 6, and TaskControllerTest 9. Three new controller tests cover rejection of every public task operation while logged out, self-assignment without duplicate dashboard results with MEDIUM default and optional date, completion and reopening followed by unassignment, and blank-title create/edit rejection with saved data unchanged. These are automated controller/SQLite checks, not GUI passes. Editor-window cleanup remains covered by the previously recorded manual M10 only. The fresh Problems tab reported 0 items in its current configuration. Production sources compiled on JDK 11.0.30 with --release 11 and -Xlint:all without diagnostics. Eclipse launched Main and reported database initialization success, but native automation could not bind to the Java window; no new manual GUI pass is claimed. See docs/FINAL_AUDIT.md and docs/FINAL_SUBMISSION_CHECKLIST.md for delivery status and limitations.</w:t>
+      </w:r>
+    </w:p>
     <w:sectPr>
       <w:footerReference w:type="default" r:id="rId9"/>
       <w:pgSz w:w="12240" w:h="15840"/>

</xml_diff>

<commit_message>
Prepare repository documentation for final course submission
</commit_message>
<xml_diff>
--- a/CS341_Project_I_TaskTracker_Alexander_Goda_Amanda_Cabrera/docs/CS341_Project_I_Testing_Report_Alexander_Goda_Amanda_Cabrera.docx
+++ b/CS341_Project_I_TaskTracker_Alexander_Goda_Amanda_Cabrera/docs/CS341_Project_I_Testing_Report_Alexander_Goda_Amanda_Cabrera.docx
@@ -53,13 +53,13 @@
     </w:p>
     <w:p>
       <w:r>
-        <w:t>The recorded JUnit run completed all 25 tests with 0 errors and 0 failures. The manual acceptance checks documented in this report passed, and the Eclipse Problems view showed 0 errors and 0 warnings.</w:t>
+        <w:t>The latest recorded JUnit run completed all 28 tests with 0 errors and 0 failures. The ten recorded manual acceptance checks passed. Earlier 25-test runs are retained below as historical results.</w:t>
       </w:r>
     </w:p>
     <w:p>
       <w:pPr/>
       <w:r>
-        <w:t>The post-fix Eclipse JUnit rerun on October 16, 2026 completed 25/25 tests with 0 errors and 0 failures in 0.413 seconds, as shown in the 11:33 PM screenshot. The existing suite still contains 25 methods; no new automated GUI test was added. Manual regression check M10 passed: the user confirmed that both New Task and Edit Task windows closed automatically when Logout was clicked. The subsequent screenshot shows Amanda's dashboard without the old editors. This is manual GUI evidence, separate from the JUnit rerun.</w:t>
+        <w:t>The post-fix Eclipse JUnit rerun on October 16, 2026 completed 25/25 tests with 0 errors and 0 failures in 0.413 seconds, as shown in the 11:33 PM screenshot. That historical suite contained 25 methods; no new automated GUI test was added. Manual regression check M10 passed: Alexander confirmed that both New Task and Edit Task windows closed automatically when Logout was clicked. The subsequent screenshot shows Amanda's dashboard without the old editors. This is manual GUI evidence, separate from the JUnit rerun.</w:t>
       </w:r>
     </w:p>
     <w:p>
@@ -611,7 +611,7 @@
     </w:p>
     <w:p>
       <w:r>
-        <w:t>The suite contains 25 test methods across five classes. The summaries below describe the assertions exercised by those methods. All 25 completed successfully in the recorded suite run.</w:t>
+        <w:t>The current suite contains 28 test methods across five classes. The latest recorded full-suite run passed all 28 tests. The class summaries below describe the assertions exercised by those methods.</w:t>
       </w:r>
     </w:p>
     <w:p>
@@ -872,10 +872,7 @@
         <w:pStyle w:val="Heading2"/>
       </w:pPr>
       <w:r>
-        <w:rPr>
-          <w:color w:val="000000"/>
-        </w:rPr>
-        <w:t>TaskControllerTest   6 tests</w:t>
+        <w:t>TaskControllerTest   9 tests</w:t>
       </w:r>
     </w:p>
     <w:p>
@@ -938,10 +935,13 @@
         <w:spacing w:after="40" w:line="240" w:lineRule="auto"/>
       </w:pPr>
       <w:r>
-        <w:rPr>
-          <w:sz w:val="20"/>
-        </w:rPr>
         <w:t>6. An unrelated user cannot complete the task; SecurityException is raised and completion remains false.</w:t>
+        <w:br/>
+        <w:t>7. Logged-out users cannot read or change tasks; stored data remains unchanged.</w:t>
+        <w:br/>
+        <w:t>8. Self-assignment returns one relevant task; MEDIUM defaults, optional dates, completion/reopening, and unassignment persist correctly.</w:t>
+        <w:br/>
+        <w:t>9. Blank titles are rejected for create and edit without adding a task or changing saved data.</w:t>
       </w:r>
     </w:p>
     <w:p>
@@ -2319,7 +2319,7 @@
                 <w:b w:val="0"/>
                 <w:sz w:val="20"/>
               </w:rPr>
-              <w:t>Both editors closed automatically on Logout, as confirmed by the user. The subsequent Amanda dashboard screenshot shows no old editors.</w:t>
+              <w:t>Both editors closed automatically on Logout, as confirmed by Alexander. The subsequent Amanda dashboard screenshot shows no old editors.</w:t>
             </w:r>
           </w:p>
         </w:tc>
@@ -2369,7 +2369,7 @@
     </w:p>
     <w:p>
       <w:r>
-        <w:t>The original automated run passed 25 tests with 0 errors and 0 failures; its Eclipse Problems view reported 0 errors and 0 warnings. The post-fix rerun also passed 25/25 with 0 errors and 0 failures in 0.413 seconds. All ten manual checks now listed passed: the original M01-M09 and the user-confirmed logout regression check M10. The rerun screenshot does not independently establish a new Problems-view warning count.</w:t>
+        <w:t>The latest recorded automated run passed 28/28 tests with 0 errors and 0 failures in 0.444 seconds. Earlier runs passed the original 25-test suite, including the post-fix rerun in 0.413 seconds. All ten recorded manual checks passed: M01–M09 and Alexander’s logout regression check M10. The latest automated run did not repeat the manual checks.</w:t>
       </w:r>
     </w:p>
     <w:p>
@@ -2385,7 +2385,7 @@
     <w:p>
       <w:pPr/>
       <w:r>
-        <w:t>Remaining coverage limits: the automated suite has no dedicated assertions for default MEDIUM priority, blank task titles, completion reopening, or editor/logout behavior. Blank-title rejection has manual evidence in M07. The earlier editor/logout limitation was corrected: the dashboard now closes its editors before ending the session. M10 records the user-confirmed manual pass; the JUnit rerun is a separate regression result. No claim of exhaustive session/error-condition coverage is made.</w:t>
+        <w:t>Remaining coverage limits: there is no automated Swing test for open-editor cleanup on logout. M10 records Alexander’s manual confirmation of that behavior. The automated suite covers default MEDIUM priority, blank-title rejection, and completion reopening. Testing does not establish exhaustive input, session, error, concurrency, security, or accessibility coverage.</w:t>
       </w:r>
     </w:p>
     <w:p>
@@ -2406,7 +2406,7 @@
     </w:p>
     <w:p>
       <w:r>
-        <w:t>2. Project test source in the tester package: DatabaseManagerTest.java, UserDAOTest.java, TaskDAOTest.java, AuthControllerTest.java and TaskControllerTest.java. The 25 test summaries correspond to the assertions in these classes.</w:t>
+        <w:t>2. Project test source in the tester package: DatabaseManagerTest.java, UserDAOTest.java, TaskDAOTest.java, AuthControllerTest.java and TaskControllerTest.java. The 28 test summaries correspond to the assertions in these classes.</w:t>
       </w:r>
     </w:p>
     <w:p>
@@ -2421,25 +2421,12 @@
     </w:p>
     <w:p>
       <w:r>
-        <w:t>5. Post-fix evidence supplied by the user on October 16, 2026: screenshots at 11:31 PM and 11:32 PM showing the open editors and subsequent Amanda dashboard; user confirmation that Logout closed both editors automatically; and the 11:33 PM Eclipse JUnit screenshot showing Runs 25/25, Errors 0, Failures 0, and 0.413 seconds.</w:t>
+        <w:t>5. Post-fix evidence supplied by Alexander on October 16, 2026: screenshots at 11:31 PM and 11:32 PM showing the open editors and subsequent Amanda dashboard; user confirmation that Logout closed both editors automatically; and the 11:33 PM Eclipse JUnit screenshot showing Runs 25/25, Errors 0, Failures 0, and 0.413 seconds.</w:t>
       </w:r>
     </w:p>
     <w:p>
       <w:r>
         <w:br w:type="page"/>
-      </w:r>
-    </w:p>
-    <w:p>
-      <w:pPr>
-        <w:pStyle w:val="Heading1"/>
-      </w:pPr>
-      <w:r>
-        <w:t>Final audit addendum</w:t>
-      </w:r>
-    </w:p>
-    <w:p>
-      <w:r>
-        <w:t>Final audit addendum dated October 16, 2026. This addendum supersedes current-suite counts and coverage-limit statements above while preserving historical results and Week 1/Week 2 plans. The expanded Eclipse JUnit 5 suite passed 28/28 tests with 0 errors and 0 failures in 0.444 seconds. Class counts are DatabaseManagerTest 2, UserDAOTest 5, TaskDAOTest 6, AuthControllerTest 6, and TaskControllerTest 9. Three new controller tests cover rejection of every public task operation while logged out, self-assignment without duplicate dashboard results with MEDIUM default and optional date, completion and reopening followed by unassignment, and blank-title create/edit rejection with saved data unchanged. These are automated controller/SQLite checks, not GUI passes. Editor-window cleanup remains covered by the previously recorded manual M10 only. The fresh Problems tab reported 0 items in its current configuration. Production sources compiled on JDK 11.0.30 with --release 11 and -Xlint:all without diagnostics. Eclipse launched Main and reported database initialization success, but native automation could not bind to the Java window; no new manual GUI pass is claimed. See docs/FINAL_AUDIT.md and docs/FINAL_SUBMISSION_CHECKLIST.md for delivery status and limitations.</w:t>
       </w:r>
     </w:p>
     <w:sectPr>

</xml_diff>